<commit_message>
Ajustando documento de carta de asignacion
</commit_message>
<xml_diff>
--- a/public/plantillas/CARTA_ASIGNACION.docx
+++ b/public/plantillas/CARTA_ASIGNACION.docx
@@ -281,13 +281,31 @@
         <w:rPr>
           <w:rFonts w:ascii="Arial" w:hAnsi="Arial"/>
         </w:rPr>
-        <w:t>como responsable de los servicios preventivos de seguridad y salud en el trabajo (SUPERVISOR SS</w:t>
-      </w:r>
-      <w:r>
-        <w:rPr>
-          <w:rFonts w:ascii="Arial" w:hAnsi="Arial"/>
-        </w:rPr>
-        <w:t>T</w:t>
+        <w:t>como responsable de los servicios preventivos de seguridad y salud en el trabajo (</w:t>
+      </w:r>
+      <w:r>
+        <w:rPr>
+          <w:rFonts w:ascii="Arial" w:hAnsi="Arial"/>
+          <w:b/>
+          <w:bCs/>
+        </w:rPr>
+        <w:t>{</w:t>
+      </w:r>
+      <w:r>
+        <w:rPr>
+          <w:rFonts w:ascii="Arial" w:hAnsi="Arial" w:hint="eastAsia"/>
+          <w:b/>
+          <w:bCs/>
+        </w:rPr>
+        <w:t>PUESTO</w:t>
+      </w:r>
+      <w:r>
+        <w:rPr>
+          <w:rFonts w:ascii="Arial" w:hAnsi="Arial"/>
+          <w:b/>
+          <w:bCs/>
+        </w:rPr>
+        <w:t>}</w:t>
       </w:r>
       <w:r>
         <w:rPr>

</xml_diff>

<commit_message>
Ajustando cambios de multi-tenant para garantizar integridad de los datos
</commit_message>
<xml_diff>
--- a/public/plantillas/CARTA_ASIGNACION.docx
+++ b/public/plantillas/CARTA_ASIGNACION.docx
@@ -569,6 +569,59 @@
           <w:rFonts w:ascii="Arial" w:hAnsi="Arial"/>
         </w:rPr>
       </w:pPr>
+      <w:r>
+        <w:rPr>
+          <w:noProof/>
+        </w:rPr>
+        <w:drawing>
+          <wp:anchor distT="0" distB="0" distL="114300" distR="114300" simplePos="0" relativeHeight="251659264" behindDoc="0" locked="0" layoutInCell="1" allowOverlap="1" wp14:anchorId="7735C505" wp14:editId="64D43C43">
+            <wp:simplePos x="0" y="0"/>
+            <wp:positionH relativeFrom="column">
+              <wp:posOffset>1577612</wp:posOffset>
+            </wp:positionH>
+            <wp:positionV relativeFrom="paragraph">
+              <wp:posOffset>48895</wp:posOffset>
+            </wp:positionV>
+            <wp:extent cx="2380343" cy="768471"/>
+            <wp:effectExtent l="0" t="0" r="0" b="0"/>
+            <wp:wrapNone/>
+            <wp:docPr id="1991258593" name="Picture 56"/>
+            <wp:cNvGraphicFramePr>
+              <a:graphicFrameLocks xmlns:a="http://schemas.openxmlformats.org/drawingml/2006/main" noChangeAspect="1"/>
+            </wp:cNvGraphicFramePr>
+            <a:graphic xmlns:a="http://schemas.openxmlformats.org/drawingml/2006/main">
+              <a:graphicData uri="http://schemas.openxmlformats.org/drawingml/2006/picture">
+                <pic:pic xmlns:pic="http://schemas.openxmlformats.org/drawingml/2006/picture">
+                  <pic:nvPicPr>
+                    <pic:cNvPr id="56" name="Picture 56"/>
+                    <pic:cNvPicPr/>
+                  </pic:nvPicPr>
+                  <pic:blipFill>
+                    <a:blip r:embed="rId5"/>
+                    <a:stretch/>
+                  </pic:blipFill>
+                  <pic:spPr>
+                    <a:xfrm>
+                      <a:off x="0" y="0"/>
+                      <a:ext cx="2380343" cy="768471"/>
+                    </a:xfrm>
+                    <a:prstGeom prst="rect">
+                      <a:avLst/>
+                    </a:prstGeom>
+                    <a:noFill/>
+                  </pic:spPr>
+                </pic:pic>
+              </a:graphicData>
+            </a:graphic>
+            <wp14:sizeRelH relativeFrom="margin">
+              <wp14:pctWidth>0</wp14:pctWidth>
+            </wp14:sizeRelH>
+            <wp14:sizeRelV relativeFrom="margin">
+              <wp14:pctHeight>0</wp14:pctHeight>
+            </wp14:sizeRelV>
+          </wp:anchor>
+        </w:drawing>
+      </w:r>
     </w:p>
     <w:p>
       <w:pPr>

</xml_diff>